<commit_message>
feat: updates for style
</commit_message>
<xml_diff>
--- a/output/sample.docx
+++ b/output/sample.docx
@@ -1246,7 +1246,7 @@
                               <w:noProof/>
                               <w:color w:val="000000"/>
                             </w:rPr>
-                            <w:t>Unclassified | Non classifié</w:t>
+                            <w:t>Clean Title</w:t>
                           </w:r>
                         </w:p>
                       </w:txbxContent>
@@ -1287,7 +1287,7 @@
                         <w:noProof/>
                         <w:color w:val="000000"/>
                       </w:rPr>
-                      <w:t>Unclassified | Non classifié</w:t>
+                      <w:t>Clean Title</w:t>
                     </w:r>
                   </w:p>
                 </w:txbxContent>
@@ -1309,7 +1309,7 @@
       <w:pStyle w:val="Header"/>
     </w:pPr>
     <w:r>
-      <w:t>[Untitled Document]</w:t>
+      <w:t>Clean Title</w:t>
     </w:r>
   </w:p>
 </w:hdr>
@@ -1632,7 +1632,7 @@
                               <w:sz w:val="22"/>
                               <w:szCs w:val="22"/>
                             </w:rPr>
-                            <w:t>Unclassified | Non classifié</w:t>
+                            <w:t>Clean Title</w:t>
                           </w:r>
                         </w:p>
                       </w:txbxContent>
@@ -1677,7 +1677,7 @@
                         <w:sz w:val="22"/>
                         <w:szCs w:val="22"/>
                       </w:rPr>
-                      <w:t>Unclassified | Non classifié</w:t>
+                      <w:t>Clean Title</w:t>
                     </w:r>
                   </w:p>
                 </w:txbxContent>

</xml_diff>